<commit_message>
feat(advanced): M01/M02 lecture texts and scripts, anti-slop check, fuller Drive deploy
M01 and M02 get lecture text and full instructor script (MD/DOCX); deck builders
fail on banned AI-slop vocabulary and copy all deliverables to Drive; M03 lecture
text refresh; unused diagram images and shared_tools/make_base.py removed; README
tree updated.

Co-Authored-By: Claude Opus 5.5 <noreply@anthropic.com>
</commit_message>
<xml_diff>
--- a/Advanced GenAI — Course Production/M03/M03_01_Lecture_Text_FINAL.docx
+++ b/Advanced GenAI — Course Production/M03/M03_01_Lecture_Text_FINAL.docx
@@ -118,27 +118,27 @@
     </w:p>
     <w:p>
       <w:r>
-        <w:t>--&gt; Document Layout Parser &amp; OCR</w:t>
+        <w:t xml:space="preserve">  --&gt; Document Layout Parser &amp; OCR</w:t>
       </w:r>
     </w:p>
     <w:p>
       <w:r>
-        <w:t>--&gt; Structure-Aware Chunking Engine</w:t>
+        <w:t xml:space="preserve">  --&gt; Structure-Aware Chunking Engine</w:t>
       </w:r>
     </w:p>
     <w:p>
       <w:r>
-        <w:t>--&gt; Metadata &amp; ACL Extractor</w:t>
+        <w:t xml:space="preserve">  --&gt; Metadata &amp; ACL Extractor</w:t>
       </w:r>
     </w:p>
     <w:p>
       <w:r>
-        <w:t>--&gt; Embedding Model (Dense Vectors) &amp; BM25 Inverted Index (Sparse Tokens)</w:t>
+        <w:t xml:space="preserve">  --&gt; Embedding Model (Dense Vectors) &amp; BM25 Inverted Index (Sparse Tokens)</w:t>
       </w:r>
     </w:p>
     <w:p>
       <w:r>
-        <w:t>--&gt; Vector Database &amp; Hybrid Index Storage</w:t>
+        <w:t xml:space="preserve">  --&gt; Vector Database &amp; Hybrid Index Storage</w:t>
       </w:r>
     </w:p>
     <w:p>
@@ -153,47 +153,47 @@
     </w:p>
     <w:p>
       <w:r>
-        <w:t>--&gt; Identity &amp; Authorization Service (Extract User Role / ACLs)</w:t>
+        <w:t xml:space="preserve">  --&gt; Identity &amp; Authorization Service (Extract User Role / ACLs)</w:t>
       </w:r>
     </w:p>
     <w:p>
       <w:r>
-        <w:t>--&gt; Metadata Pre-Filtering Gate (Remove Unauthorized Chunks)</w:t>
+        <w:t xml:space="preserve">  --&gt; Metadata Pre-Filtering Gate (Remove Unauthorized Chunks)</w:t>
       </w:r>
     </w:p>
     <w:p>
       <w:r>
-        <w:t>--&gt; Hybrid Candidate Retrieval (Dense Cosine Similarity + Sparse BM25)</w:t>
+        <w:t xml:space="preserve">  --&gt; Hybrid Candidate Retrieval (Dense Cosine Similarity + Sparse BM25)</w:t>
       </w:r>
     </w:p>
     <w:p>
       <w:r>
-        <w:t>--&gt; Reciprocal Rank Fusion (RRF) &amp; Cross-Encoder Reranking</w:t>
+        <w:t xml:space="preserve">  --&gt; Reciprocal Rank Fusion (RRF) &amp; Cross-Encoder Reranking</w:t>
       </w:r>
     </w:p>
     <w:p>
       <w:r>
-        <w:t>--&gt; Context Assembly &amp; Lost-in-the-Middle Positioning</w:t>
+        <w:t xml:space="preserve">  --&gt; Context Assembly &amp; Lost-in-the-Middle Positioning</w:t>
       </w:r>
     </w:p>
     <w:p>
       <w:r>
-        <w:t>--&gt; Grounded Prompt Synthesis with Strict Citation Constraints</w:t>
+        <w:t xml:space="preserve">  --&gt; Grounded Prompt Synthesis with Strict Citation Constraints</w:t>
       </w:r>
     </w:p>
     <w:p>
       <w:r>
-        <w:t>--&gt; LLM Inference Engine</w:t>
+        <w:t xml:space="preserve">  --&gt; LLM Inference Engine</w:t>
       </w:r>
     </w:p>
     <w:p>
       <w:r>
-        <w:t>--&gt; Citation Verification &amp; Anti-Hallucination Output Guardrail</w:t>
+        <w:t xml:space="preserve">  --&gt; Citation Verification &amp; Anti-Hallucination Output Guardrail</w:t>
       </w:r>
     </w:p>
     <w:p>
       <w:r>
-        <w:t>--&gt; User Response with Verifiable Inline Citations</w:t>
+        <w:t xml:space="preserve">  --&gt; User Response with Verifiable Inline Citations</w:t>
       </w:r>
     </w:p>
     <w:p>
@@ -223,9 +223,7 @@
       <w:r>
         <w:t>$$\mathbf{e} = f_{</w:t>
         <w:tab/>
-        <w:t>heta}(</w:t>
-        <w:tab/>
-        <w:t>ext{text}) \in \mathbb{R}^d$$</w:t>
+        <w:t>heta}(\text{text}) \in \mathbb{R}^d$$</w:t>
       </w:r>
     </w:p>
     <w:p>
@@ -240,19 +238,7 @@
     </w:p>
     <w:p>
       <w:r>
-        <w:t>$$</w:t>
-        <w:tab/>
-        <w:t>ext{CosineSimilarity}(\mathbf{u}, \mathbf{v}) =</w:t>
-      </w:r>
-    </w:p>
-    <w:p>
-      <w:r>
-        <w:t>rac{\mathbf{u} \cdot \mathbf{v}}{\|\mathbf{u}\|_2 \|\mathbf{v}\|_2} =</w:t>
-      </w:r>
-    </w:p>
-    <w:p>
-      <w:r>
-        <w:t>rac{\sum_{i=1}^d u_i v_i}{\sqrt{\sum_{i=1}^d u_i^2} \sqrt{\sum_{i=1}^d v_i^2}}$$</w:t>
+        <w:t>$$\text{CosineSimilarity}(\mathbf{u}, \mathbf{v}) = \frac{\mathbf{u} \cdot \mathbf{v}}{\|\mathbf{u}\|_2 \|\mathbf{v}\|_2} = \frac{\sum_{i=1}^d u_i v_i}{\sqrt{\sum_{i=1}^d u_i^2} \sqrt{\sum_{i=1}^d v_i^2}}$$</w:t>
       </w:r>
     </w:p>
     <w:p>
@@ -262,9 +248,7 @@
     </w:p>
     <w:p>
       <w:r>
-        <w:t>$$</w:t>
-        <w:tab/>
-        <w:t>ext{CosineSimilarity}(\mathbf{u}, \mathbf{v}) = \mathbf{u} \cdot \mathbf{v} = \sum_{i=1}^d u_i v_i$$</w:t>
+        <w:t>$$\text{CosineSimilarity}(\mathbf{u}, \mathbf{v}) = \mathbf{u} \cdot \mathbf{v} = \sum_{i=1}^d u_i v_i$$</w:t>
       </w:r>
     </w:p>
     <w:p>
@@ -286,18 +270,27 @@
       </w:r>
     </w:p>
     <w:p>
+      <w:pPr>
+        <w:pStyle w:val="ListNumber"/>
+      </w:pPr>
       <w:r>
-        <w:t>1. **Naive Fixed-Size Character Chunking**: Splits text every $N$ characters (e.g., 500 chars with 50 char overlap). Highly fragile: cuts sentences mid-thought, separates table rows from column headers, and destroys paragraph context.</w:t>
+        <w:t>**Naive Fixed-Size Character Chunking**: Splits text every $N$ characters (e.g., 500 chars with 50 char overlap). Highly fragile: cuts sentences mid-thought, separates table rows from column headers, and destroys paragraph context.</w:t>
       </w:r>
     </w:p>
     <w:p>
+      <w:pPr>
+        <w:pStyle w:val="ListNumber"/>
+      </w:pPr>
       <w:r>
-        <w:t>2. **Structure-Aware Markdown Chunking**: Splits on structural document tokens (headings `#`, `##`, list boundaries, tables). Keeps entire logical sections intact. Prepend the document title and heading path (e.g., `Document: IT Policy &gt; Section 2: Laptop Loans`) to each chunk so the embedding model captures semantic context even if the chunk content uses generic language.</w:t>
+        <w:t>**Structure-Aware Markdown Chunking**: Splits on structural document tokens (headings `#`, `##`, list boundaries, tables). Keeps entire logical sections intact. Prepend the document title and heading path (e.g., `Document: IT Policy &gt; Section 2: Laptop Loans`) to each chunk so the embedding model captures semantic context even if the chunk content uses generic language.</w:t>
       </w:r>
     </w:p>
     <w:p>
+      <w:pPr>
+        <w:pStyle w:val="ListNumber"/>
+      </w:pPr>
       <w:r>
-        <w:t>3. **Semantic Boundary Chunking**: Computes rolling sentence-level embeddings and places chunk splits where adjacent sentence cosine similarity drops below an empirical threshold. Best for unstructured narrative text without clear headings.</w:t>
+        <w:t>**Semantic Boundary Chunking**: Computes rolling sentence-level embeddings and places chunk splits where adjacent sentence cosine similarity drops below an empirical threshold. Best for unstructured narrative text without clear headings.</w:t>
       </w:r>
     </w:p>
     <w:p>
@@ -349,9 +342,7 @@
     </w:p>
     <w:p>
       <w:r>
-        <w:t>$$</w:t>
-        <w:tab/>
-        <w:t>ext{Complexity: } O(N \cdot d)$$</w:t>
+        <w:t>$$\text{Complexity: } O(N \cdot d)$$</w:t>
       </w:r>
     </w:p>
     <w:p>
@@ -365,82 +356,67 @@
       </w:r>
     </w:p>
     <w:p>
+      <w:pPr>
+        <w:pStyle w:val="ListNumber"/>
+      </w:pPr>
       <w:r>
-        <w:t>1. **Hierarchical Navigable Small World (HNSW)**:</w:t>
+        <w:t>**Hierarchical Navigable Small World (HNSW)**:</w:t>
+      </w:r>
+    </w:p>
+    <w:p>
+      <w:r>
+        <w:t xml:space="preserve">   - Multi-layer graph structure inspired by probabilistic skip-lists.</w:t>
+      </w:r>
+    </w:p>
+    <w:p>
+      <w:r>
+        <w:t xml:space="preserve">   - The top layers have sparse nodes with long-range edges for rapid coarse-grained routing across vector space.</w:t>
+      </w:r>
+    </w:p>
+    <w:p>
+      <w:r>
+        <w:t xml:space="preserve">   - Bottom layers have dense nodes with short-range edges for fine-grained local neighborhood exploration.</w:t>
+      </w:r>
+    </w:p>
+    <w:p>
+      <w:r>
+        <w:t xml:space="preserve">   - Search complexity: $O(\log N)$ with query latency typically under 10 milliseconds.</w:t>
       </w:r>
     </w:p>
     <w:p>
       <w:pPr>
-        <w:pStyle w:val="ListBullet"/>
+        <w:pStyle w:val="ListNumber"/>
       </w:pPr>
       <w:r>
-        <w:t>Multi-layer graph structure inspired by probabilistic skip-lists.</w:t>
+        <w:t>**Inverted File Index (IVF)**:</w:t>
+      </w:r>
+    </w:p>
+    <w:p>
+      <w:r>
+        <w:t xml:space="preserve">   - Partitions vector space into $K$ Voronoi cells using k-means clustering.</w:t>
+      </w:r>
+    </w:p>
+    <w:p>
+      <w:r>
+        <w:t xml:space="preserve">   - During search, only the centroids nearest to the query vector are inspected (`nprobe` parameter).</w:t>
       </w:r>
     </w:p>
     <w:p>
       <w:pPr>
-        <w:pStyle w:val="ListBullet"/>
+        <w:pStyle w:val="ListNumber"/>
       </w:pPr>
       <w:r>
-        <w:t>The top layers have sparse nodes with long-range edges for rapid coarse-grained routing across vector space.</w:t>
-      </w:r>
-    </w:p>
-    <w:p>
-      <w:pPr>
-        <w:pStyle w:val="ListBullet"/>
-      </w:pPr>
-      <w:r>
-        <w:t>Bottom layers have dense nodes with short-range edges for fine-grained local neighborhood exploration.</w:t>
-      </w:r>
-    </w:p>
-    <w:p>
-      <w:pPr>
-        <w:pStyle w:val="ListBullet"/>
-      </w:pPr>
-      <w:r>
-        <w:t>Search complexity: $O(\log N)$ with query latency typically under 10 milliseconds.</w:t>
+        <w:t>**Quantization (SQ8 and PQ)**:</w:t>
       </w:r>
     </w:p>
     <w:p>
       <w:r>
-        <w:t>2. **Inverted File Index (IVF)**:</w:t>
-      </w:r>
-    </w:p>
-    <w:p>
-      <w:pPr>
-        <w:pStyle w:val="ListBullet"/>
-      </w:pPr>
-      <w:r>
-        <w:t>Partitions vector space into $K$ Voronoi cells using k-means clustering.</w:t>
-      </w:r>
-    </w:p>
-    <w:p>
-      <w:pPr>
-        <w:pStyle w:val="ListBullet"/>
-      </w:pPr>
-      <w:r>
-        <w:t>During search, only the centroids nearest to the query vector are inspected (`nprobe` parameter).</w:t>
+        <w:t xml:space="preserve">   - **Scalar Quantization (SQ8)**: Compresses 32-bit floating-point numbers into 8-bit integers, reducing memory footprint by 75% with under 1% accuracy degradation.</w:t>
       </w:r>
     </w:p>
     <w:p>
       <w:r>
-        <w:t>3. **Quantization (SQ8 and PQ)**:</w:t>
-      </w:r>
-    </w:p>
-    <w:p>
-      <w:pPr>
-        <w:pStyle w:val="ListBullet"/>
-      </w:pPr>
-      <w:r>
-        <w:t>**Scalar Quantization (SQ8)**: Compresses 32-bit floating-point numbers into 8-bit integers, reducing memory footprint by 75% with under 1% accuracy degradation.</w:t>
-      </w:r>
-    </w:p>
-    <w:p>
-      <w:pPr>
-        <w:pStyle w:val="ListBullet"/>
-      </w:pPr>
-      <w:r>
-        <w:t>**Product Quantization (PQ)**: Deconstructs high-dimensional vectors into $M$ sub-vectors and quantizes them into cluster centroids, achieving up to 95% memory reduction.</w:t>
+        <w:t xml:space="preserve">   - **Product Quantization (PQ)**: Deconstructs high-dimensional vectors into $M$ sub-vectors and quantizes them into cluster centroids, achieving up to 95% memory reduction.</w:t>
       </w:r>
     </w:p>
     <w:p>
@@ -471,17 +447,11 @@
     </w:p>
     <w:p>
       <w:r>
-        <w:t xml:space="preserve">$$1,000,000 </w:t>
+        <w:t xml:space="preserve">  $$1,000,000 </w:t>
         <w:tab/>
         <w:t xml:space="preserve">imes 1536 </w:t>
         <w:tab/>
-        <w:t xml:space="preserve">imes 4 </w:t>
-        <w:tab/>
-        <w:t xml:space="preserve">ext{ bytes} = 6,144,000,000 </w:t>
-        <w:tab/>
-        <w:t xml:space="preserve">ext{ bytes} pprox 6.14 </w:t>
-        <w:tab/>
-        <w:t>ext{ GB}$$</w:t>
+        <w:t>imes 4 \text{ bytes} = 6,144,000,000 \text{ bytes} \approx 6.14 \text{ GB}$$</w:t>
       </w:r>
     </w:p>
     <w:p>
@@ -494,18 +464,14 @@
     </w:p>
     <w:p>
       <w:r>
-        <w:t>Graph connectivity edges ($M=16$ to $32$ neighbors per node) add an additional 1.5x to 2.0x memory overhead:</w:t>
+        <w:t xml:space="preserve">  Graph connectivity edges ($M=16$ to $32$ neighbors per node) add an additional 1.5x to 2.0x memory overhead:</w:t>
       </w:r>
     </w:p>
     <w:p>
       <w:r>
-        <w:t xml:space="preserve">$$6.14 </w:t>
+        <w:t xml:space="preserve">  $$6.14 \text{ GB} </w:t>
         <w:tab/>
-        <w:t xml:space="preserve">ext{ GB} </w:t>
-        <w:tab/>
-        <w:t xml:space="preserve">imes 1.75 pprox 10.75 </w:t>
-        <w:tab/>
-        <w:t>ext{ GB RAM}$$</w:t>
+        <w:t>imes 1.75 \approx 10.75 \text{ GB RAM}$$</w:t>
       </w:r>
     </w:p>
     <w:p>
@@ -518,18 +484,14 @@
     </w:p>
     <w:p>
       <w:r>
-        <w:t>Text content, document IDs, timestamps, and ACL strings typically consume 2 to 5 KB per chunk:</w:t>
+        <w:t xml:space="preserve">  Text content, document IDs, timestamps, and ACL strings typically consume 2 to 5 KB per chunk:</w:t>
       </w:r>
     </w:p>
     <w:p>
       <w:r>
-        <w:t xml:space="preserve">$$1,000,000 </w:t>
+        <w:t xml:space="preserve">  $$1,000,000 </w:t>
         <w:tab/>
-        <w:t xml:space="preserve">imes 3 </w:t>
-        <w:tab/>
-        <w:t xml:space="preserve">ext{ KB} = 3.0 </w:t>
-        <w:tab/>
-        <w:t>ext{ GB}$$</w:t>
+        <w:t>imes 3 \text{ KB} = 3.0 \text{ GB}$$</w:t>
       </w:r>
     </w:p>
     <w:p>
@@ -537,11 +499,7 @@
         <w:pStyle w:val="ListBullet"/>
       </w:pPr>
       <w:r>
-        <w:t xml:space="preserve">**Total Required Memory**: $pprox 14 </w:t>
-        <w:tab/>
-        <w:t xml:space="preserve">ext{ to } 16 </w:t>
-        <w:tab/>
-        <w:t>ext{ GB RAM}$ for 1 million unquantized vectors.</w:t>
+        <w:t>**Total Required Memory**: $\approx 14 \text{ to } 16 \text{ GB RAM}$ for 1 million unquantized vectors.</w:t>
       </w:r>
     </w:p>
     <w:p>
@@ -549,11 +507,7 @@
         <w:pStyle w:val="ListBullet"/>
       </w:pPr>
       <w:r>
-        <w:t xml:space="preserve">**With SQ8 Quantization (int8)**: The raw vector footprint shrinks to $1.54 </w:t>
-        <w:tab/>
-        <w:t xml:space="preserve">ext{ GB}$, fitting the entire vector index comfortably into under $4 </w:t>
-        <w:tab/>
-        <w:t>ext{ GB}$ of RAM.</w:t>
+        <w:t>**With SQ8 Quantization (int8)**: The raw vector footprint shrinks to $1.54 \text{ GB}$, fitting the entire vector index comfortably into under $4 \text{ GB}$ of RAM.</w:t>
       </w:r>
     </w:p>
     <w:p>
@@ -600,25 +554,12 @@
     </w:p>
     <w:p>
       <w:r>
-        <w:t>$$</w:t>
-        <w:tab/>
-        <w:t>ext{RRF\_Score}(d) = \sum_{m \in \{</w:t>
-        <w:tab/>
-        <w:t xml:space="preserve">ext{dense}, </w:t>
-        <w:tab/>
-        <w:t>ext{sparse}\}}</w:t>
+        <w:t xml:space="preserve">  $$\text{RRF\_Score}(d) = \sum_{m \in \{\text{dense}, \text{sparse}\}} \frac{1}{k + \text{Rank}_m(d)}$$</w:t>
       </w:r>
     </w:p>
     <w:p>
       <w:r>
-        <w:t xml:space="preserve">rac{1}{k + </w:t>
-        <w:tab/>
-        <w:t>ext{Rank}_m(d)}$$</w:t>
-      </w:r>
-    </w:p>
-    <w:p>
-      <w:r>
-        <w:t>where $k$ is an empirical smoothing constant (typically $k=60$). RRF ensures that items ranking well across both dense and sparse pipelines are boosted to the top.</w:t>
+        <w:t xml:space="preserve">  where $k$ is an empirical smoothing constant (typically $k=60$). RRF ensures that items ranking well across both dense and sparse pipelines are boosted to the top.</w:t>
       </w:r>
     </w:p>
     <w:p>
@@ -641,15 +582,7 @@
     </w:p>
     <w:p>
       <w:r>
-        <w:t>$$</w:t>
-        <w:tab/>
-        <w:t xml:space="preserve">ext{Score} = </w:t>
-        <w:tab/>
-        <w:t>ext{CrossEncoder}([</w:t>
-        <w:tab/>
-        <w:t xml:space="preserve">ext{Query} \,;\, </w:t>
-        <w:tab/>
-        <w:t>ext{Document}])$$</w:t>
+        <w:t>$$\text{Score} = \text{CrossEncoder}([\text{Query} \,;\, \text{Document}])$$</w:t>
       </w:r>
     </w:p>
     <w:p>
@@ -658,17 +591,19 @@
       </w:r>
     </w:p>
     <w:p>
+      <w:pPr>
+        <w:pStyle w:val="ListNumber"/>
+      </w:pPr>
       <w:r>
-        <w:t>1. First Stage: Hybrid search retrieves top-50 candidates ($15</w:t>
-        <w:tab/>
-        <w:t>ext{ms}$).</w:t>
+        <w:t>First Stage: Hybrid search retrieves top-50 candidates ($15\text{ms}$).</w:t>
       </w:r>
     </w:p>
     <w:p>
+      <w:pPr>
+        <w:pStyle w:val="ListNumber"/>
+      </w:pPr>
       <w:r>
-        <w:t>2. Second Stage: Cross-encoder reranks top-50 down to the top-5 highest-confidence chunks ($40</w:t>
-        <w:tab/>
-        <w:t>ext{ms}$).</w:t>
+        <w:t>Second Stage: Cross-encoder reranks top-50 down to the top-5 highest-confidence chunks ($40\text{ms}$).</w:t>
       </w:r>
     </w:p>
     <w:p>
@@ -714,18 +649,27 @@
       </w:r>
     </w:p>
     <w:p>
+      <w:pPr>
+        <w:pStyle w:val="ListNumber"/>
+      </w:pPr>
       <w:r>
-        <w:t>1. **Boundary Positioning**: Place the highest-scoring evidence chunks at the top of the prompt.</w:t>
+        <w:t>**Boundary Positioning**: Place the highest-scoring evidence chunks at the top of the prompt.</w:t>
       </w:r>
     </w:p>
     <w:p>
+      <w:pPr>
+        <w:pStyle w:val="ListNumber"/>
+      </w:pPr>
       <w:r>
-        <w:t>2. **Task Recency**: Repeat the exact query, required output schema, and citation instructions at the very bottom of the prompt, immediately preceding the generation token.</w:t>
+        <w:t>**Task Recency**: Repeat the exact query, required output schema, and citation instructions at the very bottom of the prompt, immediately preceding the generation token.</w:t>
       </w:r>
     </w:p>
     <w:p>
+      <w:pPr>
+        <w:pStyle w:val="ListNumber"/>
+      </w:pPr>
       <w:r>
-        <w:t>3. **Context Budgeting**: Trim irrelevant peripheral tokens rather than stuffing context windows to their maximum limit.</w:t>
+        <w:t>**Context Budgeting**: Trim irrelevant peripheral tokens rather than stuffing context windows to their maximum limit.</w:t>
       </w:r>
     </w:p>
     <w:p>
@@ -747,18 +691,27 @@
       </w:r>
     </w:p>
     <w:p>
+      <w:pPr>
+        <w:pStyle w:val="ListNumber"/>
+      </w:pPr>
       <w:r>
-        <w:t>1. **Explicit Granularity**: Citations must specify document ID, revision version, and section/table identifier: `[Source: POL-IT-101 § Section 2: Temporary Hardware Loans]`.</w:t>
+        <w:t>**Explicit Granularity**: Citations must specify document ID, revision version, and section/table identifier: `[Source: POL-IT-101 § Section 2: Temporary Hardware Loans]`.</w:t>
       </w:r>
     </w:p>
     <w:p>
+      <w:pPr>
+        <w:pStyle w:val="ListNumber"/>
+      </w:pPr>
       <w:r>
-        <w:t>2. **Verifiable Claim Attribution**: Every distinct factual clause must be immediately followed by its supporting citation tag.</w:t>
+        <w:t>**Verifiable Claim Attribution**: Every distinct factual clause must be immediately followed by its supporting citation tag.</w:t>
       </w:r>
     </w:p>
     <w:p>
+      <w:pPr>
+        <w:pStyle w:val="ListNumber"/>
+      </w:pPr>
       <w:r>
-        <w:t>3. **Mandatory Refusal Boundary**: The system prompt must explicitly state: *"If the provided evidence context does not contain sufficient facts to answer the question, state: 'Insufficient evidence in approved policy' and do not extrapolate."*</w:t>
+        <w:t>**Mandatory Refusal Boundary**: The system prompt must explicitly state: *"If the provided evidence context does not contain sufficient facts to answer the question, state: 'Insufficient evidence in approved policy' and do not extrapolate."*</w:t>
       </w:r>
     </w:p>
     <w:p>
@@ -775,18 +728,27 @@
       </w:r>
     </w:p>
     <w:p>
+      <w:pPr>
+        <w:pStyle w:val="ListNumber"/>
+      </w:pPr>
       <w:r>
-        <w:t>1. **Cost Economics**: Processing 1,000,000 input tokens on every user query costs $3.50 to $7.00 per query. A hybrid RAG query with 2,000 context tokens costs under $0.005 (a 700x cost differential).</w:t>
+        <w:t>**Cost Economics**: Processing 1,000,000 input tokens on every user query costs $3.50 to $7.00 per query. A hybrid RAG query with 2,000 context tokens costs under $0.005 (a 700x cost differential).</w:t>
       </w:r>
     </w:p>
     <w:p>
+      <w:pPr>
+        <w:pStyle w:val="ListNumber"/>
+      </w:pPr>
       <w:r>
-        <w:t>2. **Time to First Token (TTFT)**: Processing 1M tokens through transformer prefill takes 15 to 30 seconds of latency before the first output word streams. RAG responds in under 1 second.</w:t>
+        <w:t>**Time to First Token (TTFT)**: Processing 1M tokens through transformer prefill takes 15 to 30 seconds of latency before the first output word streams. RAG responds in under 1 second.</w:t>
       </w:r>
     </w:p>
     <w:p>
+      <w:pPr>
+        <w:pStyle w:val="ListNumber"/>
+      </w:pPr>
       <w:r>
-        <w:t>3. **Attention Degradation**: In-context needle-in-a-haystack accuracy degrades when multiple conflicting, outdated, or noisy documents are crammed into prompt memory.</w:t>
+        <w:t>**Attention Degradation**: In-context needle-in-a-haystack accuracy degrades when multiple conflicting, outdated, or noisy documents are crammed into prompt memory.</w:t>
       </w:r>
     </w:p>
     <w:p>
@@ -808,28 +770,43 @@
       </w:r>
     </w:p>
     <w:p>
+      <w:pPr>
+        <w:pStyle w:val="ListNumber"/>
+      </w:pPr>
       <w:r>
-        <w:t>1. **Ingestion Gap**: Critical content was corrupted by OCR, ignored by the scraper, or truncated.</w:t>
+        <w:t>**Ingestion Gap**: Critical content was corrupted by OCR, ignored by the scraper, or truncated.</w:t>
       </w:r>
     </w:p>
     <w:p>
+      <w:pPr>
+        <w:pStyle w:val="ListNumber"/>
+      </w:pPr>
       <w:r>
-        <w:t>2. **Chunking Fracture**: Relevant text was split across chunk boundaries, severing the subject from the predicate.</w:t>
+        <w:t>**Chunking Fracture**: Relevant text was split across chunk boundaries, severing the subject from the predicate.</w:t>
       </w:r>
     </w:p>
     <w:p>
+      <w:pPr>
+        <w:pStyle w:val="ListNumber"/>
+      </w:pPr>
       <w:r>
-        <w:t>3. **Retrieval Miss**: Query terms had zero overlap with sparse index and semantic embedding similarity was too low.</w:t>
+        <w:t>**Retrieval Miss**: Query terms had zero overlap with sparse index and semantic embedding similarity was too low.</w:t>
       </w:r>
     </w:p>
     <w:p>
+      <w:pPr>
+        <w:pStyle w:val="ListNumber"/>
+      </w:pPr>
       <w:r>
-        <w:t>4. **Security Filter Exclusion**: Overly aggressive ACL metadata filter dropped the valid chunk.</w:t>
+        <w:t>**Security Filter Exclusion**: Overly aggressive ACL metadata filter dropped the valid chunk.</w:t>
       </w:r>
     </w:p>
     <w:p>
+      <w:pPr>
+        <w:pStyle w:val="ListNumber"/>
+      </w:pPr>
       <w:r>
-        <w:t>5. **Reranking Fall**: Legitimate chunk was ranked outside top-k due to noisy candidate competition.</w:t>
+        <w:t>**Reranking Fall**: Legitimate chunk was ranked outside top-k due to noisy candidate competition.</w:t>
       </w:r>
     </w:p>
     <w:p>
@@ -856,69 +833,54 @@
       </w:r>
     </w:p>
     <w:p>
+      <w:pPr>
+        <w:pStyle w:val="ListNumber"/>
+      </w:pPr>
       <w:r>
-        <w:t>1. **Retrieval-Track Metrics** (Evaluated against curated golden Q&amp;A datasets):</w:t>
+        <w:t>**Retrieval-Track Metrics** (Evaluated against curated golden Q&amp;A datasets):</w:t>
+      </w:r>
+    </w:p>
+    <w:p>
+      <w:r>
+        <w:t xml:space="preserve">   - **Hit Rate**: Percentage of queries where at least one ground-truth document is present in top-k.</w:t>
+      </w:r>
+    </w:p>
+    <w:p>
+      <w:r>
+        <w:t xml:space="preserve">   - **Recall@k**: Fraction of all relevant ground-truth chunks retrieved in top-k.</w:t>
+      </w:r>
+    </w:p>
+    <w:p>
+      <w:r>
+        <w:t xml:space="preserve">   - **Mean Reciprocal Rank (MRR)**: Evaluates whether the primary correct chunk is ranked at #1 vs lower.</w:t>
+      </w:r>
+    </w:p>
+    <w:p>
+      <w:r>
+        <w:t xml:space="preserve">   - **NDCG@k (Normalized Discounted Cumulative Gain)**: Measures grading quality across ranked candidates.</w:t>
       </w:r>
     </w:p>
     <w:p>
       <w:pPr>
-        <w:pStyle w:val="ListBullet"/>
+        <w:pStyle w:val="ListNumber"/>
       </w:pPr>
       <w:r>
-        <w:t>**Hit Rate**: Percentage of queries where at least one ground-truth document is present in top-k.</w:t>
-      </w:r>
-    </w:p>
-    <w:p>
-      <w:pPr>
-        <w:pStyle w:val="ListBullet"/>
-      </w:pPr>
-      <w:r>
-        <w:t>**Recall@k**: Fraction of all relevant ground-truth chunks retrieved in top-k.</w:t>
-      </w:r>
-    </w:p>
-    <w:p>
-      <w:pPr>
-        <w:pStyle w:val="ListBullet"/>
-      </w:pPr>
-      <w:r>
-        <w:t>**Mean Reciprocal Rank (MRR)**: Evaluates whether the primary correct chunk is ranked at #1 vs lower.</w:t>
-      </w:r>
-    </w:p>
-    <w:p>
-      <w:pPr>
-        <w:pStyle w:val="ListBullet"/>
-      </w:pPr>
-      <w:r>
-        <w:t>**NDCG@k (Normalized Discounted Cumulative Gain)**: Measures grading quality across ranked candidates.</w:t>
+        <w:t>**Generation-Track Metrics** (Evaluated via LLM-as-a-Judge):</w:t>
       </w:r>
     </w:p>
     <w:p>
       <w:r>
-        <w:t>2. **Generation-Track Metrics** (Evaluated via LLM-as-a-Judge):</w:t>
+        <w:t xml:space="preserve">   - **Context Relevance**: Measures noise-to-signal ratio within retrieved chunks.</w:t>
       </w:r>
     </w:p>
     <w:p>
-      <w:pPr>
-        <w:pStyle w:val="ListBullet"/>
-      </w:pPr>
       <w:r>
-        <w:t>**Context Relevance**: Measures noise-to-signal ratio within retrieved chunks.</w:t>
+        <w:t xml:space="preserve">   - **Groundedness / Faithfulness**: Percentage of claims in the generated response that can be mathematically verified against the provided context.</w:t>
       </w:r>
     </w:p>
     <w:p>
-      <w:pPr>
-        <w:pStyle w:val="ListBullet"/>
-      </w:pPr>
       <w:r>
-        <w:t>**Groundedness / Faithfulness**: Percentage of claims in the generated response that can be mathematically verified against the provided context.</w:t>
-      </w:r>
-    </w:p>
-    <w:p>
-      <w:pPr>
-        <w:pStyle w:val="ListBullet"/>
-      </w:pPr>
-      <w:r>
-        <w:t>**Answer Relevance**: Measures whether the generated response directly answers the user's specific query.</w:t>
+        <w:t xml:space="preserve">   - **Answer Relevance**: Measures whether the generated response directly answers the user's specific query.</w:t>
       </w:r>
     </w:p>
     <w:p>
@@ -1363,6 +1325,11 @@
     <w:name w:val="Normal"/>
     <w:qFormat/>
     <w:rsid w:val="00FC693F"/>
+    <w:rPr>
+      <w:rFonts w:ascii="Calibri" w:hAnsi="Calibri"/>
+      <w:color w:val="1E293B"/>
+      <w:sz w:val="22"/>
+    </w:rPr>
   </w:style>
   <w:style w:type="paragraph" w:styleId="Header">
     <w:name w:val="header"/>

</xml_diff>